<commit_message>
TS 1.1 to 1.8 Kramam final loaded
</commit_message>
<xml_diff>
--- a/TS-Kramam/TS-1.2/TS 1.2 Tamil Krama Paatam Corrections.docx
+++ b/TS-Kramam/TS-1.2/TS 1.2 Tamil Krama Paatam Corrections.docx
@@ -1874,10 +1874,21 @@
                 <w:rFonts w:ascii="Latha" w:hAnsi="Latha" w:cs="Latha"/>
                 <w:sz w:val="28"/>
                 <w:szCs w:val="28"/>
-                <w:cs/>
-                <w:lang w:bidi="ta-IN"/>
-              </w:rPr>
-              <w:t>தாமனு</w:t>
+                <w:highlight w:val="yellow"/>
+                <w:cs/>
+                <w:lang w:bidi="ta-IN"/>
+              </w:rPr>
+              <w:t>தா</w:t>
+            </w:r>
+            <w:r>
+              <w:rPr>
+                <w:rFonts w:ascii="Latha" w:hAnsi="Latha" w:cs="Latha"/>
+                <w:sz w:val="28"/>
+                <w:szCs w:val="28"/>
+                <w:cs/>
+                <w:lang w:bidi="ta-IN"/>
+              </w:rPr>
+              <w:t>மனு</w:t>
             </w:r>
             <w:r>
               <w:rPr>
@@ -2045,6 +2056,7 @@
                 <w:rFonts w:ascii="Latha" w:hAnsi="Latha" w:cs="Latha"/>
                 <w:sz w:val="28"/>
                 <w:szCs w:val="28"/>
+                <w:highlight w:val="green"/>
                 <w:cs/>
                 <w:lang w:bidi="ta-IN"/>
               </w:rPr>
@@ -12761,6 +12773,7 @@
                 <w:cs/>
                 <w:lang w:bidi="ta-IN"/>
               </w:rPr>
+              <w:lastRenderedPageBreak/>
               <w:t>அ</w:t>
             </w:r>
             <w:r>
@@ -12883,7 +12896,27 @@
                 <w:szCs w:val="28"/>
                 <w:lang w:bidi="ta-IN"/>
               </w:rPr>
-              <w:t>(correct representation of Pragraha)</w:t>
+              <w:t xml:space="preserve">(correct representation of </w:t>
+            </w:r>
+            <w:proofErr w:type="spellStart"/>
+            <w:r>
+              <w:rPr>
+                <w:rFonts w:ascii="Latha" w:hAnsi="Latha" w:cs="Latha"/>
+                <w:sz w:val="28"/>
+                <w:szCs w:val="28"/>
+                <w:lang w:bidi="ta-IN"/>
+              </w:rPr>
+              <w:t>Pragraha</w:t>
+            </w:r>
+            <w:proofErr w:type="spellEnd"/>
+            <w:r>
+              <w:rPr>
+                <w:rFonts w:ascii="Latha" w:hAnsi="Latha" w:cs="Latha"/>
+                <w:sz w:val="28"/>
+                <w:szCs w:val="28"/>
+                <w:lang w:bidi="ta-IN"/>
+              </w:rPr>
+              <w:t>)</w:t>
             </w:r>
           </w:p>
         </w:tc>
@@ -12916,7 +12949,6 @@
                 <w:szCs w:val="36"/>
                 <w:lang w:bidi="ml-IN"/>
               </w:rPr>
-              <w:lastRenderedPageBreak/>
               <w:t>TS 1.2.9.1</w:t>
             </w:r>
             <w:r>

</xml_diff>